<commit_message>
fin de Sprint 22/10
</commit_message>
<xml_diff>
--- a/Sprint 2.docx
+++ b/Sprint 2.docx
@@ -2413,7 +2413,15 @@
             </w:pPr>
             <w:r>
               <w:rPr/>
-              <w:t xml:space="preserve">l’utilisateur reçoit un mail de confirmation avec les infos de son compte </w:t>
+              <w:t xml:space="preserve">l’utilisateur reçoit un mail de confirmation </w:t>
+            </w:r>
+            <w:r>
+              <w:rPr/>
+              <w:t>avec un lien pour créer son compte</w:t>
+            </w:r>
+            <w:r>
+              <w:rPr/>
+              <w:t xml:space="preserve"> </w:t>
             </w:r>
           </w:p>
         </w:tc>
@@ -2437,7 +2445,23 @@
             </w:pPr>
             <w:r>
               <w:rPr/>
-              <w:t>Prévu Sprint 2 12/10</w:t>
+              <w:t xml:space="preserve">Prévu Sprint </w:t>
+            </w:r>
+            <w:r>
+              <w:rPr/>
+              <w:t>3</w:t>
+            </w:r>
+            <w:r>
+              <w:rPr/>
+              <w:t xml:space="preserve"> </w:t>
+            </w:r>
+            <w:r>
+              <w:rPr/>
+              <w:t>22</w:t>
+            </w:r>
+            <w:r>
+              <w:rPr/>
+              <w:t>/10</w:t>
             </w:r>
           </w:p>
         </w:tc>
@@ -2486,6 +2510,231 @@
             <w:r>
               <w:rPr/>
               <w:t>5</w:t>
+            </w:r>
+          </w:p>
+        </w:tc>
+      </w:tr>
+      <w:tr>
+        <w:trPr/>
+        <w:tc>
+          <w:tcPr>
+            <w:tcW w:w="2435" w:type="dxa"/>
+            <w:tcBorders>
+              <w:start w:val="single" w:sz="8" w:space="0" w:color="000000"/>
+              <w:bottom w:val="single" w:sz="8" w:space="0" w:color="000000"/>
+              <w:end w:val="single" w:sz="8" w:space="0" w:color="000000"/>
+            </w:tcBorders>
+            <w:shd w:fill="auto" w:val="clear"/>
+          </w:tcPr>
+          <w:p>
+            <w:pPr>
+              <w:pStyle w:val="normal1"/>
+              <w:rPr/>
+            </w:pPr>
+            <w:r>
+              <w:rPr/>
+              <w:t xml:space="preserve">en tant qu’admin je souhaite pouvoir donner </w:t>
+            </w:r>
+            <w:r>
+              <w:rPr/>
+              <w:t>ou retirer</w:t>
+            </w:r>
+            <w:r>
+              <w:rPr/>
+              <w:t xml:space="preserve"> le rôle de coach a un utilisateur afin qu’il puisse créer des cours.</w:t>
+            </w:r>
+          </w:p>
+        </w:tc>
+        <w:tc>
+          <w:tcPr>
+            <w:tcW w:w="1914" w:type="dxa"/>
+            <w:tcBorders>
+              <w:start w:val="single" w:sz="8" w:space="0" w:color="000000"/>
+              <w:bottom w:val="single" w:sz="8" w:space="0" w:color="000000"/>
+              <w:end w:val="single" w:sz="8" w:space="0" w:color="000000"/>
+            </w:tcBorders>
+            <w:shd w:fill="auto" w:val="clear"/>
+          </w:tcPr>
+          <w:p>
+            <w:pPr>
+              <w:pStyle w:val="normal1"/>
+              <w:widowControl w:val="false"/>
+              <w:numPr>
+                <w:ilvl w:val="0"/>
+                <w:numId w:val="2"/>
+              </w:numPr>
+              <w:spacing w:lineRule="auto" w:line="240"/>
+              <w:ind w:hanging="360" w:start="720"/>
+              <w:rPr/>
+            </w:pPr>
+            <w:r>
+              <w:rPr/>
+              <w:t xml:space="preserve">L’utilisateur devient un coach </w:t>
+            </w:r>
+          </w:p>
+          <w:p>
+            <w:pPr>
+              <w:pStyle w:val="normal1"/>
+              <w:widowControl w:val="false"/>
+              <w:numPr>
+                <w:ilvl w:val="0"/>
+                <w:numId w:val="2"/>
+              </w:numPr>
+              <w:spacing w:lineRule="auto" w:line="240"/>
+              <w:ind w:hanging="360" w:start="720"/>
+              <w:rPr/>
+            </w:pPr>
+            <w:r>
+              <w:rPr/>
+              <w:t xml:space="preserve">le changement est visible dans la bdd </w:t>
+            </w:r>
+          </w:p>
+          <w:p>
+            <w:pPr>
+              <w:pStyle w:val="normal1"/>
+              <w:widowControl w:val="false"/>
+              <w:numPr>
+                <w:ilvl w:val="0"/>
+                <w:numId w:val="2"/>
+              </w:numPr>
+              <w:spacing w:lineRule="auto" w:line="240"/>
+              <w:ind w:hanging="360" w:start="720"/>
+              <w:rPr/>
+            </w:pPr>
+            <w:r>
+              <w:rPr/>
+              <w:t>L’admin dispose de la liste des utilisateurs</w:t>
+            </w:r>
+          </w:p>
+          <w:p>
+            <w:pPr>
+              <w:pStyle w:val="normal1"/>
+              <w:widowControl w:val="false"/>
+              <w:numPr>
+                <w:ilvl w:val="0"/>
+                <w:numId w:val="2"/>
+              </w:numPr>
+              <w:spacing w:lineRule="auto" w:line="240"/>
+              <w:ind w:hanging="360" w:start="720"/>
+              <w:rPr/>
+            </w:pPr>
+            <w:r>
+              <w:rPr/>
+              <w:t>l’utilisateur est alerté par mail d’un changement</w:t>
+            </w:r>
+          </w:p>
+          <w:p>
+            <w:pPr>
+              <w:pStyle w:val="normal1"/>
+              <w:widowControl w:val="false"/>
+              <w:numPr>
+                <w:ilvl w:val="0"/>
+                <w:numId w:val="2"/>
+              </w:numPr>
+              <w:spacing w:lineRule="auto" w:line="240"/>
+              <w:ind w:hanging="360" w:start="720"/>
+              <w:rPr/>
+            </w:pPr>
+            <w:r>
+              <w:rPr/>
+              <w:t xml:space="preserve">confirmation de changement </w:t>
+            </w:r>
+          </w:p>
+          <w:p>
+            <w:pPr>
+              <w:pStyle w:val="normal1"/>
+              <w:widowControl w:val="false"/>
+              <w:numPr>
+                <w:ilvl w:val="0"/>
+                <w:numId w:val="0"/>
+              </w:numPr>
+              <w:spacing w:lineRule="auto" w:line="240"/>
+              <w:ind w:hanging="0" w:start="720"/>
+              <w:rPr/>
+            </w:pPr>
+            <w:r>
+              <w:rPr/>
+            </w:r>
+          </w:p>
+        </w:tc>
+        <w:tc>
+          <w:tcPr>
+            <w:tcW w:w="1530" w:type="dxa"/>
+            <w:tcBorders>
+              <w:start w:val="single" w:sz="8" w:space="0" w:color="000000"/>
+              <w:bottom w:val="single" w:sz="8" w:space="0" w:color="000000"/>
+              <w:end w:val="single" w:sz="8" w:space="0" w:color="000000"/>
+            </w:tcBorders>
+            <w:shd w:fill="auto" w:val="clear"/>
+          </w:tcPr>
+          <w:p>
+            <w:pPr>
+              <w:pStyle w:val="normal1"/>
+              <w:widowControl w:val="false"/>
+              <w:spacing w:lineRule="auto" w:line="240"/>
+              <w:rPr/>
+            </w:pPr>
+            <w:r>
+              <w:rPr/>
+              <w:t>Prévu Sprint 3</w:t>
+            </w:r>
+          </w:p>
+          <w:p>
+            <w:pPr>
+              <w:pStyle w:val="normal1"/>
+              <w:widowControl w:val="false"/>
+              <w:spacing w:lineRule="auto" w:line="240"/>
+              <w:rPr/>
+            </w:pPr>
+            <w:r>
+              <w:rPr/>
+              <w:t>22/10</w:t>
+            </w:r>
+          </w:p>
+        </w:tc>
+        <w:tc>
+          <w:tcPr>
+            <w:tcW w:w="1080" w:type="dxa"/>
+            <w:tcBorders>
+              <w:start w:val="single" w:sz="8" w:space="0" w:color="000000"/>
+              <w:bottom w:val="single" w:sz="8" w:space="0" w:color="000000"/>
+              <w:end w:val="single" w:sz="8" w:space="0" w:color="000000"/>
+            </w:tcBorders>
+            <w:shd w:fill="auto" w:val="clear"/>
+          </w:tcPr>
+          <w:p>
+            <w:pPr>
+              <w:pStyle w:val="normal1"/>
+              <w:widowControl w:val="false"/>
+              <w:spacing w:lineRule="auto" w:line="240"/>
+              <w:rPr/>
+            </w:pPr>
+            <w:r>
+              <w:rPr/>
+              <w:t>Terminé</w:t>
+            </w:r>
+          </w:p>
+        </w:tc>
+        <w:tc>
+          <w:tcPr>
+            <w:tcW w:w="1953" w:type="dxa"/>
+            <w:tcBorders>
+              <w:start w:val="single" w:sz="8" w:space="0" w:color="000000"/>
+              <w:bottom w:val="single" w:sz="8" w:space="0" w:color="000000"/>
+              <w:end w:val="single" w:sz="8" w:space="0" w:color="000000"/>
+            </w:tcBorders>
+            <w:shd w:fill="auto" w:val="clear"/>
+          </w:tcPr>
+          <w:p>
+            <w:pPr>
+              <w:pStyle w:val="normal1"/>
+              <w:widowControl w:val="false"/>
+              <w:spacing w:lineRule="auto" w:line="240"/>
+              <w:rPr/>
+            </w:pPr>
+            <w:r>
+              <w:rPr/>
+              <w:t>2</w:t>
             </w:r>
           </w:p>
         </w:tc>
@@ -2508,11 +2757,16 @@
           <w:p>
             <w:pPr>
               <w:pStyle w:val="normal1"/>
-              <w:rPr/>
-            </w:pPr>
-            <w:r>
-              <w:rPr/>
-              <w:t>En tant que client je souhaite pouvoir réserver une séance de sport en prenant compte des créneaux disponible</w:t>
+              <w:numPr>
+                <w:ilvl w:val="0"/>
+                <w:numId w:val="0"/>
+              </w:numPr>
+              <w:ind w:hanging="0" w:start="360"/>
+              <w:rPr/>
+            </w:pPr>
+            <w:r>
+              <w:rPr/>
+              <w:t>en tant qu’utilisateur je souhaite voir les cours disponibles afin de pouvoir faire une réservation au guichet (temporairement)</w:t>
             </w:r>
           </w:p>
         </w:tc>
@@ -2537,6 +2791,76 @@
             </w:pPr>
             <w:r>
               <w:rPr/>
+              <w:t xml:space="preserve">- </w:t>
+            </w:r>
+            <w:r>
+              <w:rPr/>
+              <w:t xml:space="preserve">visualisation d’un planning </w:t>
+            </w:r>
+          </w:p>
+          <w:p>
+            <w:pPr>
+              <w:pStyle w:val="normal1"/>
+              <w:widowControl w:val="false"/>
+              <w:spacing w:lineRule="auto" w:line="240"/>
+              <w:ind w:hanging="360" w:start="720"/>
+              <w:rPr/>
+            </w:pPr>
+            <w:r>
+              <w:rPr/>
+              <w:t>-les différents cours  y sont affiché</w:t>
+            </w:r>
+          </w:p>
+          <w:p>
+            <w:pPr>
+              <w:pStyle w:val="normal1"/>
+              <w:widowControl w:val="false"/>
+              <w:spacing w:lineRule="auto" w:line="240"/>
+              <w:ind w:hanging="360" w:start="720"/>
+              <w:rPr/>
+            </w:pPr>
+            <w:r>
+              <w:rPr/>
+              <w:t>-pas de réservation</w:t>
+            </w:r>
+          </w:p>
+          <w:p>
+            <w:pPr>
+              <w:pStyle w:val="normal1"/>
+              <w:widowControl w:val="false"/>
+              <w:spacing w:lineRule="auto" w:line="240"/>
+              <w:ind w:hanging="360" w:start="720"/>
+              <w:rPr/>
+            </w:pPr>
+            <w:r>
+              <w:rPr/>
+              <w:t xml:space="preserve">-nombre de places dispos et l’intitulé du cours </w:t>
+            </w:r>
+          </w:p>
+          <w:p>
+            <w:pPr>
+              <w:pStyle w:val="normal1"/>
+              <w:widowControl w:val="false"/>
+              <w:spacing w:lineRule="auto" w:line="240"/>
+              <w:ind w:hanging="360" w:start="720"/>
+              <w:rPr/>
+            </w:pPr>
+            <w:r>
+              <w:rPr/>
+              <w:t xml:space="preserve">et la durée </w:t>
+            </w:r>
+          </w:p>
+          <w:p>
+            <w:pPr>
+              <w:pStyle w:val="normal1"/>
+              <w:widowControl w:val="false"/>
+              <w:spacing w:lineRule="auto" w:line="240"/>
+              <w:ind w:hanging="360" w:start="720"/>
+              <w:rPr/>
+            </w:pPr>
+            <w:r>
+              <w:rPr/>
+              <w:t xml:space="preserve"> </w:t>
             </w:r>
           </w:p>
         </w:tc>
@@ -2560,6 +2884,18 @@
             </w:pPr>
             <w:r>
               <w:rPr/>
+              <w:t>Sprint 3 22/10</w:t>
+            </w:r>
+          </w:p>
+          <w:p>
+            <w:pPr>
+              <w:pStyle w:val="normal1"/>
+              <w:widowControl w:val="false"/>
+              <w:spacing w:lineRule="auto" w:line="240"/>
+              <w:rPr/>
+            </w:pPr>
+            <w:r>
+              <w:rPr/>
             </w:r>
           </w:p>
         </w:tc>
@@ -2583,6 +2919,7 @@
             </w:pPr>
             <w:r>
               <w:rPr/>
+              <w:t>Terminé</w:t>
             </w:r>
           </w:p>
         </w:tc>
@@ -2606,6 +2943,7 @@
             </w:pPr>
             <w:r>
               <w:rPr/>
+              <w:t>8</w:t>
             </w:r>
           </w:p>
           <w:p>
@@ -2732,6 +3070,7 @@
             </w:pPr>
             <w:r>
               <w:rPr/>
+              <w:t>5</w:t>
             </w:r>
           </w:p>
         </w:tc>
@@ -2753,11 +3092,16 @@
           <w:p>
             <w:pPr>
               <w:pStyle w:val="normal1"/>
-              <w:rPr/>
-            </w:pPr>
-            <w:r>
-              <w:rPr/>
-              <w:t>en tant qu’admin je souhaite pouvoir donner le rôle de coach a un utilisateur</w:t>
+              <w:numPr>
+                <w:ilvl w:val="0"/>
+                <w:numId w:val="0"/>
+              </w:numPr>
+              <w:ind w:hanging="0" w:start="0"/>
+              <w:rPr/>
+            </w:pPr>
+            <w:r>
+              <w:rPr/>
+              <w:t>En tant qu’utilisateur je souhaite pouvoir faire une demande pour devenir coach afin de créer des cours</w:t>
             </w:r>
           </w:p>
         </w:tc>
@@ -2847,6 +3191,7 @@
             </w:pPr>
             <w:r>
               <w:rPr/>
+              <w:t>2</w:t>
             </w:r>
           </w:p>
         </w:tc>
@@ -2962,6 +3307,7 @@
             </w:pPr>
             <w:r>
               <w:rPr/>
+              <w:t>1</w:t>
             </w:r>
           </w:p>
         </w:tc>
@@ -2992,7 +3338,7 @@
             </w:pPr>
             <w:r>
               <w:rPr/>
-              <w:t>en tant qu’utilisateur je souhaite voir les cours disponibles afin de pouvoir faire une réservation</w:t>
+              <w:t>En tant que client je souhaite pouvoir réserver une séance de sport en prenant compte des créneaux disponible</w:t>
             </w:r>
           </w:p>
         </w:tc>
@@ -3082,6 +3428,7 @@
             </w:pPr>
             <w:r>
               <w:rPr/>
+              <w:t>8</w:t>
             </w:r>
           </w:p>
         </w:tc>
@@ -3174,6 +3521,7 @@
             </w:pPr>
             <w:r>
               <w:rPr/>
+              <w:t xml:space="preserve">Terminé Sprint 3 22/10 </w:t>
             </w:r>
           </w:p>
         </w:tc>
@@ -3196,6 +3544,7 @@
             </w:pPr>
             <w:r>
               <w:rPr/>
+              <w:t>Terminé</w:t>
             </w:r>
           </w:p>
         </w:tc>
@@ -3218,6 +3567,7 @@
             </w:pPr>
             <w:r>
               <w:rPr/>
+              <w:t>2</w:t>
             </w:r>
           </w:p>
         </w:tc>
@@ -3338,6 +3688,7 @@
             </w:pPr>
             <w:r>
               <w:rPr/>
+              <w:t>5</w:t>
             </w:r>
           </w:p>
         </w:tc>
@@ -3458,6 +3809,7 @@
             </w:pPr>
             <w:r>
               <w:rPr/>
+              <w:t>3</w:t>
             </w:r>
           </w:p>
         </w:tc>
@@ -3483,7 +3835,7 @@
                 <w:ilvl w:val="0"/>
                 <w:numId w:val="0"/>
               </w:numPr>
-              <w:ind w:hanging="0" w:start="360"/>
+              <w:ind w:hanging="0" w:start="0"/>
               <w:rPr/>
             </w:pPr>
             <w:r>
@@ -3578,6 +3930,7 @@
             </w:pPr>
             <w:r>
               <w:rPr/>
+              <w:t>10</w:t>
             </w:r>
           </w:p>
         </w:tc>
@@ -3698,6 +4051,7 @@
             </w:pPr>
             <w:r>
               <w:rPr/>
+              <w:t>10</w:t>
             </w:r>
           </w:p>
         </w:tc>
@@ -3818,6 +4172,7 @@
             </w:pPr>
             <w:r>
               <w:rPr/>
+              <w:t>2</w:t>
             </w:r>
           </w:p>
         </w:tc>
@@ -3938,6 +4293,128 @@
             </w:pPr>
             <w:r>
               <w:rPr/>
+              <w:t>2</w:t>
+            </w:r>
+          </w:p>
+        </w:tc>
+      </w:tr>
+      <w:tr>
+        <w:trPr>
+          <w:trHeight w:val="2178" w:hRule="atLeast"/>
+        </w:trPr>
+        <w:tc>
+          <w:tcPr>
+            <w:tcW w:w="2435" w:type="dxa"/>
+            <w:tcBorders>
+              <w:start w:val="single" w:sz="8" w:space="0" w:color="000000"/>
+              <w:bottom w:val="single" w:sz="8" w:space="0" w:color="000000"/>
+              <w:end w:val="single" w:sz="8" w:space="0" w:color="000000"/>
+            </w:tcBorders>
+            <w:shd w:fill="auto" w:val="clear"/>
+          </w:tcPr>
+          <w:p>
+            <w:pPr>
+              <w:pStyle w:val="normal1"/>
+              <w:numPr>
+                <w:ilvl w:val="0"/>
+                <w:numId w:val="0"/>
+              </w:numPr>
+              <w:ind w:hanging="0" w:start="0"/>
+              <w:rPr/>
+            </w:pPr>
+            <w:r>
+              <w:rPr/>
+              <w:t>En tant qu’utilisateur je souhaite pouvoir consulter le détail d’un cours</w:t>
+            </w:r>
+          </w:p>
+        </w:tc>
+        <w:tc>
+          <w:tcPr>
+            <w:tcW w:w="1914" w:type="dxa"/>
+            <w:tcBorders>
+              <w:start w:val="single" w:sz="8" w:space="0" w:color="000000"/>
+              <w:bottom w:val="single" w:sz="8" w:space="0" w:color="000000"/>
+              <w:end w:val="single" w:sz="8" w:space="0" w:color="000000"/>
+            </w:tcBorders>
+            <w:shd w:fill="auto" w:val="clear"/>
+          </w:tcPr>
+          <w:p>
+            <w:pPr>
+              <w:pStyle w:val="normal1"/>
+              <w:widowControl w:val="false"/>
+              <w:spacing w:lineRule="auto" w:line="240"/>
+              <w:ind w:hanging="360" w:start="720"/>
+              <w:rPr/>
+            </w:pPr>
+            <w:r>
+              <w:rPr/>
+            </w:r>
+          </w:p>
+        </w:tc>
+        <w:tc>
+          <w:tcPr>
+            <w:tcW w:w="1530" w:type="dxa"/>
+            <w:tcBorders>
+              <w:start w:val="single" w:sz="8" w:space="0" w:color="000000"/>
+              <w:bottom w:val="single" w:sz="8" w:space="0" w:color="000000"/>
+              <w:end w:val="single" w:sz="8" w:space="0" w:color="000000"/>
+            </w:tcBorders>
+            <w:shd w:fill="auto" w:val="clear"/>
+          </w:tcPr>
+          <w:p>
+            <w:pPr>
+              <w:pStyle w:val="normal1"/>
+              <w:widowControl w:val="false"/>
+              <w:spacing w:lineRule="auto" w:line="240"/>
+              <w:rPr/>
+            </w:pPr>
+            <w:r>
+              <w:rPr/>
+            </w:r>
+          </w:p>
+        </w:tc>
+        <w:tc>
+          <w:tcPr>
+            <w:tcW w:w="1080" w:type="dxa"/>
+            <w:tcBorders>
+              <w:start w:val="single" w:sz="8" w:space="0" w:color="000000"/>
+              <w:bottom w:val="single" w:sz="8" w:space="0" w:color="000000"/>
+              <w:end w:val="single" w:sz="8" w:space="0" w:color="000000"/>
+            </w:tcBorders>
+            <w:shd w:fill="auto" w:val="clear"/>
+          </w:tcPr>
+          <w:p>
+            <w:pPr>
+              <w:pStyle w:val="normal1"/>
+              <w:widowControl w:val="false"/>
+              <w:spacing w:lineRule="auto" w:line="240"/>
+              <w:rPr/>
+            </w:pPr>
+            <w:r>
+              <w:rPr/>
+            </w:r>
+          </w:p>
+        </w:tc>
+        <w:tc>
+          <w:tcPr>
+            <w:tcW w:w="1953" w:type="dxa"/>
+            <w:tcBorders>
+              <w:start w:val="single" w:sz="8" w:space="0" w:color="000000"/>
+              <w:bottom w:val="single" w:sz="8" w:space="0" w:color="000000"/>
+              <w:end w:val="single" w:sz="8" w:space="0" w:color="000000"/>
+            </w:tcBorders>
+            <w:shd w:fill="auto" w:val="clear"/>
+          </w:tcPr>
+          <w:p>
+            <w:pPr>
+              <w:pStyle w:val="normal1"/>
+              <w:widowControl w:val="false"/>
+              <w:spacing w:lineRule="auto" w:line="240"/>
+              <w:rPr/>
+            </w:pPr>
+            <w:r>
+              <w:rPr/>
+              <w:t>1</w:t>
             </w:r>
           </w:p>
         </w:tc>
@@ -3950,6 +4427,7 @@
       </w:pPr>
       <w:r>
         <w:rPr/>
+        <w:t>Séances planning réservation (coach fictifs...)</w:t>
       </w:r>
     </w:p>
     <w:p>
@@ -3968,101 +4446,311 @@
       </w:pPr>
       <w:r>
         <w:rPr/>
+        <w:t xml:space="preserve">coachs </w:t>
       </w:r>
     </w:p>
     <w:p>
       <w:pPr>
         <w:pStyle w:val="normal1"/>
+        <w:rPr/>
+      </w:pPr>
+      <w:r>
+        <w:rPr/>
+        <w:t xml:space="preserve">admin crée des coachs 2 </w:t>
+      </w:r>
+    </w:p>
+    <w:p>
+      <w:pPr>
+        <w:pStyle w:val="normal1"/>
+        <w:rPr/>
+      </w:pPr>
+      <w:r>
+        <w:rPr/>
+        <w:t>système de création seance</w:t>
+      </w:r>
+    </w:p>
+    <w:p>
+      <w:pPr>
+        <w:pStyle w:val="normal1"/>
+        <w:rPr/>
+      </w:pPr>
+      <w:r>
+        <w:rPr/>
+        <w:t xml:space="preserve">reservation de seance </w:t>
+      </w:r>
+    </w:p>
+    <w:p>
+      <w:pPr>
+        <w:pStyle w:val="normal1"/>
+        <w:rPr/>
+      </w:pPr>
+      <w:r>
+        <w:rPr/>
+        <w:t xml:space="preserve">planning des seances reservation au guichet pour le moment .. 3 </w:t>
+      </w:r>
+    </w:p>
+    <w:p>
+      <w:pPr>
+        <w:pStyle w:val="normal1"/>
+        <w:rPr/>
+      </w:pPr>
+      <w:r>
+        <w:rPr/>
+        <w:t>email de confirmation 1</w:t>
+      </w:r>
+    </w:p>
+    <w:p>
+      <w:pPr>
+        <w:pStyle w:val="normal1"/>
+        <w:rPr/>
+      </w:pPr>
+      <w:r>
+        <w:rPr/>
+        <w:t>demande de changement de poste (devenir coach etc, proposer ses services..)</w:t>
+      </w:r>
+    </w:p>
+    <w:p>
+      <w:pPr>
+        <w:pStyle w:val="normal1"/>
+        <w:rPr/>
+      </w:pPr>
+      <w:r>
+        <w:rPr/>
+      </w:r>
+    </w:p>
+    <w:p>
+      <w:pPr>
+        <w:pStyle w:val="normal1"/>
+        <w:rPr/>
+      </w:pPr>
+      <w:r>
+        <w:rPr/>
+      </w:r>
+    </w:p>
+    <w:p>
+      <w:pPr>
+        <w:pStyle w:val="normal1"/>
+        <w:rPr/>
+      </w:pPr>
+      <w:r>
+        <w:rPr/>
+      </w:r>
+    </w:p>
+    <w:p>
+      <w:pPr>
+        <w:pStyle w:val="normal1"/>
+        <w:rPr>
+          <w:rFonts w:ascii="Arial" w:hAnsi="Arial"/>
+          <w:b/>
+          <w:bCs/>
+        </w:rPr>
+      </w:pPr>
+      <w:r>
+        <w:rPr>
+          <w:rFonts w:ascii="Arial" w:hAnsi="Arial"/>
+          <w:b/>
+          <w:bCs/>
+        </w:rPr>
+        <w:t xml:space="preserve">Mêlée : </w:t>
+      </w:r>
+    </w:p>
+    <w:p>
+      <w:pPr>
+        <w:pStyle w:val="BodyText"/>
+        <w:rPr>
+          <w:rFonts w:ascii="Arial" w:hAnsi="Arial"/>
+        </w:rPr>
+      </w:pPr>
+      <w:r>
+        <w:rPr>
+          <w:rFonts w:ascii="Arial" w:hAnsi="Arial"/>
+          <w:b/>
+        </w:rPr>
+        <w:t>Changement d'EDT :</w:t>
+      </w:r>
+      <w:r>
+        <w:rPr>
+          <w:rFonts w:ascii="Arial" w:hAnsi="Arial"/>
+        </w:rPr>
+        <w:t xml:space="preserve"> Passage du for</w:t>
+      </w:r>
+      <w:r>
+        <w:rPr>
+          <w:rFonts w:ascii="Arial" w:hAnsi="Arial"/>
+          <w:i w:val="false"/>
+          <w:iCs w:val="false"/>
+        </w:rPr>
+        <w:t>mat liste au format agenda</w:t>
+      </w:r>
+    </w:p>
+    <w:p>
+      <w:pPr>
+        <w:pStyle w:val="BodyText"/>
         <w:numPr>
           <w:ilvl w:val="0"/>
-          <w:numId w:val="3"/>
+          <w:numId w:val="6"/>
         </w:numPr>
-        <w:ind w:hanging="360" w:start="720"/>
-        <w:rPr/>
-      </w:pPr>
-      <w:r>
-        <w:rPr/>
-      </w:r>
-    </w:p>
-    <w:p>
-      <w:pPr>
-        <w:pStyle w:val="normal1"/>
+        <w:tabs>
+          <w:tab w:val="clear" w:pos="720"/>
+          <w:tab w:val="left" w:pos="0" w:leader="none"/>
+        </w:tabs>
+        <w:ind w:hanging="283" w:start="720"/>
+        <w:rPr/>
+      </w:pPr>
+      <w:r>
+        <w:rPr>
+          <w:rFonts w:ascii="Arial" w:hAnsi="Arial"/>
+          <w:b/>
+        </w:rPr>
+        <w:t>Problème rencontré :</w:t>
+      </w:r>
+      <w:r>
+        <w:rPr>
+          <w:rFonts w:ascii="Arial" w:hAnsi="Arial"/>
+        </w:rPr>
+        <w:t xml:space="preserve"> La redirection lors de la confirmation de création de compte pointe encore vers </w:t>
+      </w:r>
+      <w:r>
+        <w:rPr>
+          <w:rStyle w:val="Textesource"/>
+          <w:rFonts w:ascii="Arial" w:hAnsi="Arial"/>
+        </w:rPr>
+        <w:t>localhost</w:t>
+      </w:r>
+      <w:r>
+        <w:rPr>
+          <w:rFonts w:ascii="Arial" w:hAnsi="Arial"/>
+        </w:rPr>
+        <w:t>.</w:t>
+      </w:r>
+    </w:p>
+    <w:p>
+      <w:pPr>
+        <w:pStyle w:val="BodyText"/>
         <w:numPr>
           <w:ilvl w:val="0"/>
-          <w:numId w:val="3"/>
+          <w:numId w:val="7"/>
         </w:numPr>
-        <w:ind w:hanging="360" w:start="720"/>
-        <w:rPr/>
-      </w:pPr>
-      <w:r>
-        <w:rPr/>
-      </w:r>
-    </w:p>
-    <w:p>
-      <w:pPr>
-        <w:pStyle w:val="normal1"/>
+        <w:tabs>
+          <w:tab w:val="clear" w:pos="720"/>
+          <w:tab w:val="left" w:pos="0" w:leader="none"/>
+        </w:tabs>
+        <w:ind w:hanging="283" w:start="720"/>
+        <w:rPr>
+          <w:rFonts w:ascii="Arial" w:hAnsi="Arial"/>
+          <w:b/>
+        </w:rPr>
+      </w:pPr>
+      <w:r>
+        <w:rPr>
+          <w:rFonts w:ascii="Arial" w:hAnsi="Arial"/>
+          <w:b/>
+        </w:rPr>
+        <w:t>Avancement :</w:t>
+      </w:r>
+    </w:p>
+    <w:p>
+      <w:pPr>
+        <w:pStyle w:val="BodyText"/>
         <w:numPr>
           <w:ilvl w:val="0"/>
-          <w:numId w:val="3"/>
+          <w:numId w:val="7"/>
         </w:numPr>
-        <w:ind w:hanging="360" w:start="720"/>
-        <w:rPr/>
-      </w:pPr>
-      <w:r>
-        <w:rPr/>
-      </w:r>
-    </w:p>
-    <w:p>
-      <w:pPr>
-        <w:pStyle w:val="normal1"/>
+        <w:tabs>
+          <w:tab w:val="clear" w:pos="720"/>
+          <w:tab w:val="left" w:pos="0" w:leader="none"/>
+        </w:tabs>
+        <w:ind w:hanging="283" w:start="720"/>
+        <w:rPr>
+          <w:rFonts w:ascii="Arial" w:hAnsi="Arial"/>
+        </w:rPr>
+      </w:pPr>
+      <w:r>
+        <w:rPr>
+          <w:rFonts w:ascii="Arial" w:hAnsi="Arial"/>
+        </w:rPr>
+        <w:t>La tache du panel admin terminé.</w:t>
+      </w:r>
+    </w:p>
+    <w:p>
+      <w:pPr>
+        <w:pStyle w:val="BodyText"/>
         <w:numPr>
           <w:ilvl w:val="0"/>
-          <w:numId w:val="3"/>
+          <w:numId w:val="8"/>
         </w:numPr>
-        <w:ind w:hanging="360" w:start="720"/>
-        <w:rPr/>
-      </w:pPr>
-      <w:r>
-        <w:rPr/>
-        <w:t xml:space="preserve"> </w:t>
-      </w:r>
-    </w:p>
-    <w:p>
-      <w:pPr>
-        <w:pStyle w:val="normal1"/>
+        <w:tabs>
+          <w:tab w:val="clear" w:pos="720"/>
+          <w:tab w:val="left" w:pos="0" w:leader="none"/>
+        </w:tabs>
+        <w:ind w:hanging="283" w:start="709"/>
+        <w:rPr>
+          <w:rFonts w:ascii="Arial" w:hAnsi="Arial"/>
+        </w:rPr>
+      </w:pPr>
+      <w:r>
+        <w:rPr>
+          <w:rFonts w:ascii="Arial" w:hAnsi="Arial"/>
+        </w:rPr>
+        <w:t>Toutes les autres tâches avancent bien.</w:t>
+      </w:r>
+    </w:p>
+    <w:p>
+      <w:pPr>
+        <w:pStyle w:val="BodyText"/>
         <w:numPr>
           <w:ilvl w:val="0"/>
-          <w:numId w:val="3"/>
+          <w:numId w:val="8"/>
         </w:numPr>
-        <w:ind w:hanging="360" w:start="720"/>
-        <w:rPr/>
-      </w:pPr>
-      <w:r>
-        <w:rPr/>
-      </w:r>
-    </w:p>
-    <w:p>
-      <w:pPr>
-        <w:pStyle w:val="normal1"/>
+        <w:tabs>
+          <w:tab w:val="clear" w:pos="720"/>
+          <w:tab w:val="left" w:pos="0" w:leader="none"/>
+        </w:tabs>
+        <w:ind w:hanging="283" w:start="709"/>
+        <w:rPr>
+          <w:rFonts w:ascii="Arial" w:hAnsi="Arial"/>
+        </w:rPr>
+      </w:pPr>
+      <w:r>
+        <w:rPr>
+          <w:rFonts w:ascii="Arial" w:hAnsi="Arial"/>
+        </w:rPr>
+        <w:t>Aucun blocage majeur.</w:t>
+      </w:r>
+    </w:p>
+    <w:p>
+      <w:pPr>
+        <w:pStyle w:val="BodyText"/>
         <w:numPr>
           <w:ilvl w:val="0"/>
-          <w:numId w:val="3"/>
+          <w:numId w:val="9"/>
         </w:numPr>
-        <w:ind w:hanging="360" w:start="720"/>
-        <w:rPr/>
-      </w:pPr>
-      <w:r>
-        <w:rPr/>
+        <w:tabs>
+          <w:tab w:val="clear" w:pos="720"/>
+          <w:tab w:val="left" w:pos="0" w:leader="none"/>
+        </w:tabs>
+        <w:ind w:hanging="283" w:start="720"/>
+        <w:rPr>
+          <w:rFonts w:ascii="Arial" w:hAnsi="Arial"/>
+        </w:rPr>
+      </w:pPr>
+      <w:r>
+        <w:rPr>
+          <w:rFonts w:ascii="Arial" w:hAnsi="Arial"/>
+          <w:b/>
+        </w:rPr>
+        <w:t>Point d'équipe :</w:t>
+      </w:r>
+      <w:r>
+        <w:rPr>
+          <w:rFonts w:ascii="Arial" w:hAnsi="Arial"/>
+        </w:rPr>
+        <w:t xml:space="preserve"> Pause de code pendant la mêlée pour refondre la base de données (modification de colonnes et réinjection de données de test).</w:t>
       </w:r>
     </w:p>
     <w:p>
       <w:pPr>
         <w:pStyle w:val="normal1"/>
-        <w:numPr>
-          <w:ilvl w:val="0"/>
-          <w:numId w:val="3"/>
-        </w:numPr>
-        <w:ind w:hanging="360" w:start="720"/>
         <w:rPr/>
       </w:pPr>
       <w:r>
@@ -4072,10 +4760,17 @@
     <w:p>
       <w:pPr>
         <w:pStyle w:val="normal1"/>
-        <w:rPr/>
-      </w:pPr>
-      <w:r>
-        <w:rPr/>
+        <w:rPr>
+          <w:b/>
+          <w:bCs/>
+        </w:rPr>
+      </w:pPr>
+      <w:r>
+        <w:rPr>
+          <w:b/>
+          <w:bCs/>
+        </w:rPr>
+        <w:t xml:space="preserve">Sprint review : </w:t>
       </w:r>
     </w:p>
     <w:p>
@@ -4085,6 +4780,260 @@
       </w:pPr>
       <w:r>
         <w:rPr/>
+        <w:tab/>
+      </w:r>
+      <w:r>
+        <w:rPr/>
+        <w:t xml:space="preserve">Problème rencontré : </w:t>
+      </w:r>
+    </w:p>
+    <w:p>
+      <w:pPr>
+        <w:pStyle w:val="normal1"/>
+        <w:rPr/>
+      </w:pPr>
+      <w:r>
+        <w:rPr/>
+        <w:tab/>
+        <w:tab/>
+      </w:r>
+      <w:r>
+        <w:rPr/>
+        <w:t xml:space="preserve">manque de colonnes et de données dans la bdd pour tester les fonctionnalités </w:t>
+      </w:r>
+    </w:p>
+    <w:p>
+      <w:pPr>
+        <w:pStyle w:val="normal1"/>
+        <w:rPr/>
+      </w:pPr>
+      <w:r>
+        <w:rPr/>
+        <w:tab/>
+        <w:tab/>
+      </w:r>
+      <w:r>
+        <w:rPr/>
+        <w:t>mail de confirmation qui utilise un lien en local</w:t>
+      </w:r>
+    </w:p>
+    <w:p>
+      <w:pPr>
+        <w:pStyle w:val="normal1"/>
+        <w:rPr/>
+      </w:pPr>
+      <w:r>
+        <w:rPr/>
+        <w:tab/>
+        <w:tab/>
+      </w:r>
+      <w:r>
+        <w:rPr/>
+        <w:t xml:space="preserve">format de l’edt à changer </w:t>
+      </w:r>
+    </w:p>
+    <w:p>
+      <w:pPr>
+        <w:pStyle w:val="normal1"/>
+        <w:rPr/>
+      </w:pPr>
+      <w:r>
+        <w:rPr/>
+        <w:tab/>
+      </w:r>
+      <w:r>
+        <w:rPr/>
+        <w:t xml:space="preserve">Avancement : </w:t>
+      </w:r>
+    </w:p>
+    <w:p>
+      <w:pPr>
+        <w:pStyle w:val="normal1"/>
+        <w:rPr/>
+      </w:pPr>
+      <w:r>
+        <w:rPr/>
+        <w:tab/>
+        <w:tab/>
+      </w:r>
+      <w:r>
+        <w:rPr/>
+        <w:t xml:space="preserve">Refonte de la bdd suite a un manque d’anticipation des besoins </w:t>
+      </w:r>
+    </w:p>
+    <w:p>
+      <w:pPr>
+        <w:pStyle w:val="normal1"/>
+        <w:rPr/>
+      </w:pPr>
+      <w:r>
+        <w:rPr/>
+        <w:tab/>
+        <w:tab/>
+      </w:r>
+      <w:r>
+        <w:rPr/>
+        <w:t>mise en place d’une batterie de test</w:t>
+      </w:r>
+    </w:p>
+    <w:p>
+      <w:pPr>
+        <w:pStyle w:val="normal1"/>
+        <w:rPr/>
+      </w:pPr>
+      <w:r>
+        <w:rPr/>
+        <w:tab/>
+        <w:tab/>
+      </w:r>
+      <w:r>
+        <w:rPr/>
+        <w:t xml:space="preserve">mail de confirmation de création de compte : le compte n’est pas accessible avant la confirmation </w:t>
+      </w:r>
+    </w:p>
+    <w:p>
+      <w:pPr>
+        <w:pStyle w:val="normal1"/>
+        <w:rPr/>
+      </w:pPr>
+      <w:r>
+        <w:rPr/>
+        <w:tab/>
+        <w:tab/>
+      </w:r>
+      <w:r>
+        <w:rPr/>
+        <w:t>planning des cours fonctionnel et stylisé.</w:t>
+      </w:r>
+    </w:p>
+    <w:p>
+      <w:pPr>
+        <w:pStyle w:val="normal1"/>
+        <w:rPr/>
+      </w:pPr>
+      <w:r>
+        <w:rPr/>
+        <w:tab/>
+        <w:tab/>
+      </w:r>
+      <w:r>
+        <w:rPr/>
+        <w:t>Panel d’administration implémenté : mail de notification pour le changement de rôle, gestion des rôles admin, user et coach et ajout d’une barre de recherche pour chercher un utilisateur.</w:t>
+      </w:r>
+    </w:p>
+    <w:p>
+      <w:pPr>
+        <w:pStyle w:val="normal1"/>
+        <w:rPr/>
+      </w:pPr>
+      <w:r>
+        <w:rPr/>
+        <w:tab/>
+        <w:tab/>
+      </w:r>
+      <w:r>
+        <w:rPr/>
+        <w:t xml:space="preserve">Planning responsive et filtrable par coach et/ou par sport ; </w:t>
+      </w:r>
+      <w:r>
+        <w:rPr/>
+        <w:t>bouton voir les prochains cours si une semaine est vide</w:t>
+      </w:r>
+    </w:p>
+    <w:p>
+      <w:pPr>
+        <w:pStyle w:val="normal1"/>
+        <w:rPr/>
+      </w:pPr>
+      <w:r>
+        <w:rPr/>
+        <w:tab/>
+        <w:tab/>
+      </w:r>
+    </w:p>
+    <w:p>
+      <w:pPr>
+        <w:pStyle w:val="normal1"/>
+        <w:rPr/>
+      </w:pPr>
+      <w:r>
+        <w:rPr/>
+      </w:r>
+    </w:p>
+    <w:p>
+      <w:pPr>
+        <w:pStyle w:val="normal1"/>
+        <w:rPr>
+          <w:b/>
+          <w:bCs/>
+        </w:rPr>
+      </w:pPr>
+      <w:r>
+        <w:rPr>
+          <w:b/>
+          <w:bCs/>
+        </w:rPr>
+        <w:t xml:space="preserve">Sprint retro : </w:t>
+      </w:r>
+    </w:p>
+    <w:p>
+      <w:pPr>
+        <w:pStyle w:val="normal1"/>
+        <w:rPr/>
+      </w:pPr>
+      <w:r>
+        <w:rPr/>
+        <w:tab/>
+        <w:tab/>
+      </w:r>
+      <w:r>
+        <w:rPr/>
+        <w:t xml:space="preserve">Solution pour la bdd : prévoir la bdd plutôt avant de pouvoir continuer a coder sans avoir besoin de la pause → </w:t>
+      </w:r>
+      <w:r>
+        <w:rPr/>
+        <w:t>potentiellement plus discuter du futur..</w:t>
+      </w:r>
+    </w:p>
+    <w:p>
+      <w:pPr>
+        <w:pStyle w:val="normal1"/>
+        <w:rPr/>
+      </w:pPr>
+      <w:r>
+        <w:rPr/>
+        <w:tab/>
+        <w:tab/>
+      </w:r>
+      <w:r>
+        <w:rPr/>
+        <w:t xml:space="preserve">répartition des rôles fonctionnel chacun connaît bien son obj et le réalise </w:t>
+      </w:r>
+    </w:p>
+    <w:p>
+      <w:pPr>
+        <w:pStyle w:val="normal1"/>
+        <w:rPr/>
+      </w:pPr>
+      <w:r>
+        <w:rPr/>
+        <w:tab/>
+        <w:tab/>
+      </w:r>
+      <w:r>
+        <w:rPr/>
+        <w:t>le Scrum Master organise bien les cérémonie (mêlée et fin de sprint)</w:t>
+      </w:r>
+    </w:p>
+    <w:p>
+      <w:pPr>
+        <w:pStyle w:val="normal1"/>
+        <w:rPr/>
+      </w:pPr>
+      <w:r>
+        <w:rPr/>
+        <w:tab/>
+        <w:tab/>
       </w:r>
     </w:p>
     <w:sectPr>
@@ -4833,6 +5782,482 @@
     </w:lvl>
   </w:abstractNum>
   <w:abstractNum w:abstractNumId="6">
+    <w:lvl w:ilvl="0">
+      <w:start w:val="1"/>
+      <w:numFmt w:val="bullet"/>
+      <w:lvlText w:val=""/>
+      <w:lvlJc w:val="start"/>
+      <w:pPr>
+        <w:tabs>
+          <w:tab w:val="num" w:pos="720"/>
+        </w:tabs>
+        <w:ind w:start="720" w:hanging="283"/>
+      </w:pPr>
+      <w:rPr>
+        <w:rFonts w:ascii="Symbol" w:hAnsi="Symbol" w:cs="Symbol" w:hint="default"/>
+      </w:rPr>
+    </w:lvl>
+    <w:lvl w:ilvl="1">
+      <w:start w:val="1"/>
+      <w:numFmt w:val="decimal"/>
+      <w:lvlText w:val="%2."/>
+      <w:lvlJc w:val="start"/>
+      <w:pPr>
+        <w:tabs>
+          <w:tab w:val="num" w:pos="1080"/>
+        </w:tabs>
+        <w:ind w:start="1080" w:hanging="360"/>
+      </w:pPr>
+    </w:lvl>
+    <w:lvl w:ilvl="2">
+      <w:start w:val="1"/>
+      <w:numFmt w:val="decimal"/>
+      <w:lvlText w:val="%3."/>
+      <w:lvlJc w:val="start"/>
+      <w:pPr>
+        <w:tabs>
+          <w:tab w:val="num" w:pos="1440"/>
+        </w:tabs>
+        <w:ind w:start="1440" w:hanging="360"/>
+      </w:pPr>
+    </w:lvl>
+    <w:lvl w:ilvl="3">
+      <w:start w:val="1"/>
+      <w:numFmt w:val="decimal"/>
+      <w:lvlText w:val="%4."/>
+      <w:lvlJc w:val="start"/>
+      <w:pPr>
+        <w:tabs>
+          <w:tab w:val="num" w:pos="1800"/>
+        </w:tabs>
+        <w:ind w:start="1800" w:hanging="360"/>
+      </w:pPr>
+    </w:lvl>
+    <w:lvl w:ilvl="4">
+      <w:start w:val="1"/>
+      <w:numFmt w:val="decimal"/>
+      <w:lvlText w:val="%5."/>
+      <w:lvlJc w:val="start"/>
+      <w:pPr>
+        <w:tabs>
+          <w:tab w:val="num" w:pos="2160"/>
+        </w:tabs>
+        <w:ind w:start="2160" w:hanging="360"/>
+      </w:pPr>
+    </w:lvl>
+    <w:lvl w:ilvl="5">
+      <w:start w:val="1"/>
+      <w:numFmt w:val="decimal"/>
+      <w:lvlText w:val="%6."/>
+      <w:lvlJc w:val="start"/>
+      <w:pPr>
+        <w:tabs>
+          <w:tab w:val="num" w:pos="2520"/>
+        </w:tabs>
+        <w:ind w:start="2520" w:hanging="360"/>
+      </w:pPr>
+    </w:lvl>
+    <w:lvl w:ilvl="6">
+      <w:start w:val="1"/>
+      <w:numFmt w:val="decimal"/>
+      <w:lvlText w:val="%7."/>
+      <w:lvlJc w:val="start"/>
+      <w:pPr>
+        <w:tabs>
+          <w:tab w:val="num" w:pos="2880"/>
+        </w:tabs>
+        <w:ind w:start="2880" w:hanging="360"/>
+      </w:pPr>
+    </w:lvl>
+    <w:lvl w:ilvl="7">
+      <w:start w:val="1"/>
+      <w:numFmt w:val="decimal"/>
+      <w:lvlText w:val="%8."/>
+      <w:lvlJc w:val="start"/>
+      <w:pPr>
+        <w:tabs>
+          <w:tab w:val="num" w:pos="3240"/>
+        </w:tabs>
+        <w:ind w:start="3240" w:hanging="360"/>
+      </w:pPr>
+    </w:lvl>
+    <w:lvl w:ilvl="8">
+      <w:start w:val="1"/>
+      <w:numFmt w:val="decimal"/>
+      <w:lvlText w:val="%9."/>
+      <w:lvlJc w:val="start"/>
+      <w:pPr>
+        <w:tabs>
+          <w:tab w:val="num" w:pos="3600"/>
+        </w:tabs>
+        <w:ind w:start="3600" w:hanging="360"/>
+      </w:pPr>
+    </w:lvl>
+  </w:abstractNum>
+  <w:abstractNum w:abstractNumId="7">
+    <w:lvl w:ilvl="0">
+      <w:start w:val="1"/>
+      <w:numFmt w:val="bullet"/>
+      <w:lvlText w:val=""/>
+      <w:lvlJc w:val="start"/>
+      <w:pPr>
+        <w:tabs>
+          <w:tab w:val="num" w:pos="720"/>
+        </w:tabs>
+        <w:ind w:start="720" w:hanging="283"/>
+      </w:pPr>
+      <w:rPr>
+        <w:rFonts w:ascii="Symbol" w:hAnsi="Symbol" w:cs="Symbol" w:hint="default"/>
+      </w:rPr>
+    </w:lvl>
+    <w:lvl w:ilvl="1">
+      <w:start w:val="1"/>
+      <w:numFmt w:val="decimal"/>
+      <w:lvlText w:val="%2."/>
+      <w:lvlJc w:val="start"/>
+      <w:pPr>
+        <w:tabs>
+          <w:tab w:val="num" w:pos="1080"/>
+        </w:tabs>
+        <w:ind w:start="1080" w:hanging="360"/>
+      </w:pPr>
+    </w:lvl>
+    <w:lvl w:ilvl="2">
+      <w:start w:val="1"/>
+      <w:numFmt w:val="decimal"/>
+      <w:lvlText w:val="%3."/>
+      <w:lvlJc w:val="start"/>
+      <w:pPr>
+        <w:tabs>
+          <w:tab w:val="num" w:pos="1440"/>
+        </w:tabs>
+        <w:ind w:start="1440" w:hanging="360"/>
+      </w:pPr>
+    </w:lvl>
+    <w:lvl w:ilvl="3">
+      <w:start w:val="1"/>
+      <w:numFmt w:val="decimal"/>
+      <w:lvlText w:val="%4."/>
+      <w:lvlJc w:val="start"/>
+      <w:pPr>
+        <w:tabs>
+          <w:tab w:val="num" w:pos="1800"/>
+        </w:tabs>
+        <w:ind w:start="1800" w:hanging="360"/>
+      </w:pPr>
+    </w:lvl>
+    <w:lvl w:ilvl="4">
+      <w:start w:val="1"/>
+      <w:numFmt w:val="decimal"/>
+      <w:lvlText w:val="%5."/>
+      <w:lvlJc w:val="start"/>
+      <w:pPr>
+        <w:tabs>
+          <w:tab w:val="num" w:pos="2160"/>
+        </w:tabs>
+        <w:ind w:start="2160" w:hanging="360"/>
+      </w:pPr>
+    </w:lvl>
+    <w:lvl w:ilvl="5">
+      <w:start w:val="1"/>
+      <w:numFmt w:val="decimal"/>
+      <w:lvlText w:val="%6."/>
+      <w:lvlJc w:val="start"/>
+      <w:pPr>
+        <w:tabs>
+          <w:tab w:val="num" w:pos="2520"/>
+        </w:tabs>
+        <w:ind w:start="2520" w:hanging="360"/>
+      </w:pPr>
+    </w:lvl>
+    <w:lvl w:ilvl="6">
+      <w:start w:val="1"/>
+      <w:numFmt w:val="decimal"/>
+      <w:lvlText w:val="%7."/>
+      <w:lvlJc w:val="start"/>
+      <w:pPr>
+        <w:tabs>
+          <w:tab w:val="num" w:pos="2880"/>
+        </w:tabs>
+        <w:ind w:start="2880" w:hanging="360"/>
+      </w:pPr>
+    </w:lvl>
+    <w:lvl w:ilvl="7">
+      <w:start w:val="1"/>
+      <w:numFmt w:val="decimal"/>
+      <w:lvlText w:val="%8."/>
+      <w:lvlJc w:val="start"/>
+      <w:pPr>
+        <w:tabs>
+          <w:tab w:val="num" w:pos="3240"/>
+        </w:tabs>
+        <w:ind w:start="3240" w:hanging="360"/>
+      </w:pPr>
+    </w:lvl>
+    <w:lvl w:ilvl="8">
+      <w:start w:val="1"/>
+      <w:numFmt w:val="decimal"/>
+      <w:lvlText w:val="%9."/>
+      <w:lvlJc w:val="start"/>
+      <w:pPr>
+        <w:tabs>
+          <w:tab w:val="num" w:pos="3600"/>
+        </w:tabs>
+        <w:ind w:start="3600" w:hanging="360"/>
+      </w:pPr>
+    </w:lvl>
+  </w:abstractNum>
+  <w:abstractNum w:abstractNumId="8">
+    <w:lvl w:ilvl="0">
+      <w:start w:val="1"/>
+      <w:numFmt w:val="bullet"/>
+      <w:lvlText w:val=""/>
+      <w:lvlJc w:val="start"/>
+      <w:pPr>
+        <w:tabs>
+          <w:tab w:val="num" w:pos="709"/>
+        </w:tabs>
+        <w:ind w:start="709" w:hanging="283"/>
+      </w:pPr>
+      <w:rPr>
+        <w:rFonts w:ascii="Symbol" w:hAnsi="Symbol" w:cs="Symbol" w:hint="default"/>
+      </w:rPr>
+    </w:lvl>
+    <w:lvl w:ilvl="1">
+      <w:start w:val="1"/>
+      <w:numFmt w:val="bullet"/>
+      <w:lvlText w:val=""/>
+      <w:lvlJc w:val="start"/>
+      <w:pPr>
+        <w:tabs>
+          <w:tab w:val="num" w:pos="1418"/>
+        </w:tabs>
+        <w:ind w:start="1418" w:hanging="283"/>
+      </w:pPr>
+      <w:rPr>
+        <w:rFonts w:ascii="Symbol" w:hAnsi="Symbol" w:cs="Symbol" w:hint="default"/>
+      </w:rPr>
+    </w:lvl>
+    <w:lvl w:ilvl="2">
+      <w:start w:val="1"/>
+      <w:numFmt w:val="bullet"/>
+      <w:lvlText w:val=""/>
+      <w:lvlJc w:val="start"/>
+      <w:pPr>
+        <w:tabs>
+          <w:tab w:val="num" w:pos="2127"/>
+        </w:tabs>
+        <w:ind w:start="2127" w:hanging="283"/>
+      </w:pPr>
+      <w:rPr>
+        <w:rFonts w:ascii="Symbol" w:hAnsi="Symbol" w:cs="Symbol" w:hint="default"/>
+      </w:rPr>
+    </w:lvl>
+    <w:lvl w:ilvl="3">
+      <w:start w:val="1"/>
+      <w:numFmt w:val="bullet"/>
+      <w:lvlText w:val=""/>
+      <w:lvlJc w:val="start"/>
+      <w:pPr>
+        <w:tabs>
+          <w:tab w:val="num" w:pos="2836"/>
+        </w:tabs>
+        <w:ind w:start="2836" w:hanging="283"/>
+      </w:pPr>
+      <w:rPr>
+        <w:rFonts w:ascii="Symbol" w:hAnsi="Symbol" w:cs="Symbol" w:hint="default"/>
+      </w:rPr>
+    </w:lvl>
+    <w:lvl w:ilvl="4">
+      <w:start w:val="1"/>
+      <w:numFmt w:val="bullet"/>
+      <w:lvlText w:val=""/>
+      <w:lvlJc w:val="start"/>
+      <w:pPr>
+        <w:tabs>
+          <w:tab w:val="num" w:pos="3545"/>
+        </w:tabs>
+        <w:ind w:start="3545" w:hanging="283"/>
+      </w:pPr>
+      <w:rPr>
+        <w:rFonts w:ascii="Symbol" w:hAnsi="Symbol" w:cs="Symbol" w:hint="default"/>
+      </w:rPr>
+    </w:lvl>
+    <w:lvl w:ilvl="5">
+      <w:start w:val="1"/>
+      <w:numFmt w:val="bullet"/>
+      <w:lvlText w:val=""/>
+      <w:lvlJc w:val="start"/>
+      <w:pPr>
+        <w:tabs>
+          <w:tab w:val="num" w:pos="4254"/>
+        </w:tabs>
+        <w:ind w:start="4254" w:hanging="283"/>
+      </w:pPr>
+      <w:rPr>
+        <w:rFonts w:ascii="Symbol" w:hAnsi="Symbol" w:cs="Symbol" w:hint="default"/>
+      </w:rPr>
+    </w:lvl>
+    <w:lvl w:ilvl="6">
+      <w:start w:val="1"/>
+      <w:numFmt w:val="bullet"/>
+      <w:lvlText w:val=""/>
+      <w:lvlJc w:val="start"/>
+      <w:pPr>
+        <w:tabs>
+          <w:tab w:val="num" w:pos="4963"/>
+        </w:tabs>
+        <w:ind w:start="4963" w:hanging="283"/>
+      </w:pPr>
+      <w:rPr>
+        <w:rFonts w:ascii="Symbol" w:hAnsi="Symbol" w:cs="Symbol" w:hint="default"/>
+      </w:rPr>
+    </w:lvl>
+    <w:lvl w:ilvl="7">
+      <w:start w:val="1"/>
+      <w:numFmt w:val="bullet"/>
+      <w:lvlText w:val=""/>
+      <w:lvlJc w:val="start"/>
+      <w:pPr>
+        <w:tabs>
+          <w:tab w:val="num" w:pos="5672"/>
+        </w:tabs>
+        <w:ind w:start="5672" w:hanging="283"/>
+      </w:pPr>
+      <w:rPr>
+        <w:rFonts w:ascii="Symbol" w:hAnsi="Symbol" w:cs="Symbol" w:hint="default"/>
+      </w:rPr>
+    </w:lvl>
+    <w:lvl w:ilvl="8">
+      <w:start w:val="1"/>
+      <w:numFmt w:val="bullet"/>
+      <w:lvlText w:val=""/>
+      <w:lvlJc w:val="start"/>
+      <w:pPr>
+        <w:tabs>
+          <w:tab w:val="num" w:pos="6381"/>
+        </w:tabs>
+        <w:ind w:start="6381" w:hanging="283"/>
+      </w:pPr>
+      <w:rPr>
+        <w:rFonts w:ascii="Symbol" w:hAnsi="Symbol" w:cs="Symbol" w:hint="default"/>
+      </w:rPr>
+    </w:lvl>
+  </w:abstractNum>
+  <w:abstractNum w:abstractNumId="9">
+    <w:lvl w:ilvl="0">
+      <w:start w:val="1"/>
+      <w:numFmt w:val="bullet"/>
+      <w:lvlText w:val=""/>
+      <w:lvlJc w:val="start"/>
+      <w:pPr>
+        <w:tabs>
+          <w:tab w:val="num" w:pos="720"/>
+        </w:tabs>
+        <w:ind w:start="720" w:hanging="283"/>
+      </w:pPr>
+      <w:rPr>
+        <w:rFonts w:ascii="Symbol" w:hAnsi="Symbol" w:cs="Symbol" w:hint="default"/>
+      </w:rPr>
+    </w:lvl>
+    <w:lvl w:ilvl="1">
+      <w:start w:val="1"/>
+      <w:numFmt w:val="decimal"/>
+      <w:lvlText w:val="%2."/>
+      <w:lvlJc w:val="start"/>
+      <w:pPr>
+        <w:tabs>
+          <w:tab w:val="num" w:pos="1080"/>
+        </w:tabs>
+        <w:ind w:start="1080" w:hanging="360"/>
+      </w:pPr>
+    </w:lvl>
+    <w:lvl w:ilvl="2">
+      <w:start w:val="1"/>
+      <w:numFmt w:val="decimal"/>
+      <w:lvlText w:val="%3."/>
+      <w:lvlJc w:val="start"/>
+      <w:pPr>
+        <w:tabs>
+          <w:tab w:val="num" w:pos="1440"/>
+        </w:tabs>
+        <w:ind w:start="1440" w:hanging="360"/>
+      </w:pPr>
+    </w:lvl>
+    <w:lvl w:ilvl="3">
+      <w:start w:val="1"/>
+      <w:numFmt w:val="decimal"/>
+      <w:lvlText w:val="%4."/>
+      <w:lvlJc w:val="start"/>
+      <w:pPr>
+        <w:tabs>
+          <w:tab w:val="num" w:pos="1800"/>
+        </w:tabs>
+        <w:ind w:start="1800" w:hanging="360"/>
+      </w:pPr>
+    </w:lvl>
+    <w:lvl w:ilvl="4">
+      <w:start w:val="1"/>
+      <w:numFmt w:val="decimal"/>
+      <w:lvlText w:val="%5."/>
+      <w:lvlJc w:val="start"/>
+      <w:pPr>
+        <w:tabs>
+          <w:tab w:val="num" w:pos="2160"/>
+        </w:tabs>
+        <w:ind w:start="2160" w:hanging="360"/>
+      </w:pPr>
+    </w:lvl>
+    <w:lvl w:ilvl="5">
+      <w:start w:val="1"/>
+      <w:numFmt w:val="decimal"/>
+      <w:lvlText w:val="%6."/>
+      <w:lvlJc w:val="start"/>
+      <w:pPr>
+        <w:tabs>
+          <w:tab w:val="num" w:pos="2520"/>
+        </w:tabs>
+        <w:ind w:start="2520" w:hanging="360"/>
+      </w:pPr>
+    </w:lvl>
+    <w:lvl w:ilvl="6">
+      <w:start w:val="1"/>
+      <w:numFmt w:val="decimal"/>
+      <w:lvlText w:val="%7."/>
+      <w:lvlJc w:val="start"/>
+      <w:pPr>
+        <w:tabs>
+          <w:tab w:val="num" w:pos="2880"/>
+        </w:tabs>
+        <w:ind w:start="2880" w:hanging="360"/>
+      </w:pPr>
+    </w:lvl>
+    <w:lvl w:ilvl="7">
+      <w:start w:val="1"/>
+      <w:numFmt w:val="decimal"/>
+      <w:lvlText w:val="%8."/>
+      <w:lvlJc w:val="start"/>
+      <w:pPr>
+        <w:tabs>
+          <w:tab w:val="num" w:pos="3240"/>
+        </w:tabs>
+        <w:ind w:start="3240" w:hanging="360"/>
+      </w:pPr>
+    </w:lvl>
+    <w:lvl w:ilvl="8">
+      <w:start w:val="1"/>
+      <w:numFmt w:val="decimal"/>
+      <w:lvlText w:val="%9."/>
+      <w:lvlJc w:val="start"/>
+      <w:pPr>
+        <w:tabs>
+          <w:tab w:val="num" w:pos="3600"/>
+        </w:tabs>
+        <w:ind w:start="3600" w:hanging="360"/>
+      </w:pPr>
+    </w:lvl>
+  </w:abstractNum>
+  <w:abstractNum w:abstractNumId="10">
     <w:lvl w:ilvl="0">
       <w:start w:val="1"/>
       <w:numFmt w:val="none"/>
@@ -4968,6 +6393,18 @@
   </w:num>
   <w:num w:numId="6">
     <w:abstractNumId w:val="6"/>
+  </w:num>
+  <w:num w:numId="7">
+    <w:abstractNumId w:val="7"/>
+  </w:num>
+  <w:num w:numId="8">
+    <w:abstractNumId w:val="8"/>
+  </w:num>
+  <w:num w:numId="9">
+    <w:abstractNumId w:val="9"/>
+  </w:num>
+  <w:num w:numId="10">
+    <w:abstractNumId w:val="10"/>
   </w:num>
 </w:numbering>
 </file>
@@ -5111,6 +6548,20 @@
       <w:color w:val="666666"/>
       <w:sz w:val="22"/>
       <w:szCs w:val="22"/>
+    </w:rPr>
+  </w:style>
+  <w:style w:type="character" w:styleId="Puces">
+    <w:name w:val="Puces"/>
+    <w:qFormat/>
+    <w:rPr>
+      <w:rFonts w:ascii="OpenSymbol" w:hAnsi="OpenSymbol" w:eastAsia="OpenSymbol" w:cs="OpenSymbol"/>
+    </w:rPr>
+  </w:style>
+  <w:style w:type="character" w:styleId="Textesource">
+    <w:name w:val="Texte source"/>
+    <w:qFormat/>
+    <w:rPr>
+      <w:rFonts w:ascii="Liberation Mono" w:hAnsi="Liberation Mono" w:eastAsia="NSimSun" w:cs="Liberation Mono"/>
     </w:rPr>
   </w:style>
   <w:style w:type="paragraph" w:styleId="Titre">

</xml_diff>